<commit_message>
feat(forms): remediate BM-019 and BM-020 DOCX contracts
Insert reviewed semantic placeholders with a fail-closed OOXML remediator, refine both draft contracts, and add structural render evidence without changing runtime cutover state.
</commit_message>
<xml_diff>
--- a/storage/templates/normalized-docx/BM-019/BM-019_normalized.docx
+++ b/storage/templates/normalized-docx/BM-019/BM-019_normalized.docx
@@ -252,7 +252,7 @@
                 <w:szCs w:val="26"/>
                 <w:lang w:val="en-US" w:eastAsia="en-US"/>
               </w:rPr>
-              <w:t>VIỆN KIỂM SÁT</w:t>
+              <w:t xml:space="preserve">{{agency.parentName}} {{agency.name}}</w:t>
             </w:r>
             <w:r>
               <w:rPr>
@@ -273,7 +273,7 @@
                 <w:szCs w:val="26"/>
                 <w:lang w:val="en-US" w:eastAsia="en-US"/>
               </w:rPr>
-              <w:t xml:space="preserve"> </w:t>
+              <w:t xml:space="preserve"/>
             </w:r>
             <w:r>
               <w:rPr>
@@ -282,7 +282,7 @@
                 <w:szCs w:val="26"/>
                 <w:lang w:val="en-US" w:eastAsia="en-US"/>
               </w:rPr>
-              <w:t>…</w:t>
+              <w:t xml:space="preserve"/>
             </w:r>
             <w:r>
               <w:rPr>
@@ -292,7 +292,7 @@
                 <w:szCs w:val="24"/>
                 <w:lang w:val="en-US" w:eastAsia="en-US"/>
               </w:rPr>
-              <w:t xml:space="preserve"> </w:t>
+              <w:t xml:space="preserve"/>
             </w:r>
             <w:r>
               <w:rPr>
@@ -312,7 +312,7 @@
                 <w:szCs w:val="24"/>
                 <w:lang w:val="en-US" w:eastAsia="en-US"/>
               </w:rPr>
-              <w:t>.................................................</w:t>
+              <w:t xml:space="preserve"/>
             </w:r>
           </w:p>
           <w:p>
@@ -343,34 +343,34 @@
               <w:jc w:val="center"/>
             </w:pPr>
             <w:r>
-              <w:t>Số</w:t>
-            </w:r>
-            <w:r>
-              <w:rPr>
-                <w:lang w:val="en-US"/>
-              </w:rPr>
-              <w:t>:</w:t>
-            </w:r>
-            <w:r>
-              <w:rPr>
-                <w:lang w:val="en-US"/>
-              </w:rPr>
-              <w:t xml:space="preserve"> </w:t>
-            </w:r>
-            <w:r>
-              <w:t>…/</w:t>
-            </w:r>
-            <w:r>
-              <w:rPr>
-                <w:lang w:val="en-US"/>
-              </w:rPr>
-              <w:t>YC</w:t>
-            </w:r>
-            <w:r>
-              <w:t>-VKS</w:t>
-            </w:r>
-            <w:r>
-              <w:t>…-</w:t>
+              <w:t xml:space="preserve">Số: {{document.documentCode}}</w:t>
+            </w:r>
+            <w:r>
+              <w:rPr>
+                <w:lang w:val="en-US"/>
+              </w:rPr>
+              <w:t xml:space="preserve"/>
+            </w:r>
+            <w:r>
+              <w:rPr>
+                <w:lang w:val="en-US"/>
+              </w:rPr>
+              <w:t xml:space="preserve"/>
+            </w:r>
+            <w:r>
+              <w:t xml:space="preserve"/>
+            </w:r>
+            <w:r>
+              <w:rPr>
+                <w:lang w:val="en-US"/>
+              </w:rPr>
+              <w:t xml:space="preserve"/>
+            </w:r>
+            <w:r>
+              <w:t xml:space="preserve"/>
+            </w:r>
+            <w:r>
+              <w:t xml:space="preserve"/>
             </w:r>
             <w:r>
               <w:rPr>
@@ -379,7 +379,7 @@
               <w:footnoteReference w:id="3"/>
             </w:r>
             <w:r>
-              <w:t>…</w:t>
+              <w:t xml:space="preserve"/>
             </w:r>
           </w:p>
           <w:p>
@@ -476,7 +476,7 @@
               <w:rPr>
                 <w:iCs/>
               </w:rPr>
-              <w:t xml:space="preserve">     </w:t>
+              <w:t xml:space="preserve">{{document.issuePlaceAndDateLine}}</w:t>
             </w:r>
             <w:r>
               <w:rPr>
@@ -489,14 +489,14 @@
               <w:rPr>
                 <w:i/>
               </w:rPr>
-              <w:t>…</w:t>
+              <w:t xml:space="preserve"/>
             </w:r>
             <w:r>
               <w:rPr>
                 <w:i/>
                 <w:iCs/>
               </w:rPr>
-              <w:t>, ngày</w:t>
+              <w:t xml:space="preserve"/>
             </w:r>
             <w:r>
               <w:rPr>
@@ -504,14 +504,14 @@
                 <w:iCs/>
                 <w:lang w:val="en-US"/>
               </w:rPr>
-              <w:t xml:space="preserve"> </w:t>
+              <w:t xml:space="preserve"/>
             </w:r>
             <w:r>
               <w:rPr>
                 <w:i/>
                 <w:iCs/>
               </w:rPr>
-              <w:t>… tháng</w:t>
+              <w:t xml:space="preserve"/>
             </w:r>
             <w:r>
               <w:rPr>
@@ -519,14 +519,14 @@
                 <w:iCs/>
                 <w:lang w:val="en-US"/>
               </w:rPr>
-              <w:t xml:space="preserve"> </w:t>
+              <w:t xml:space="preserve"/>
             </w:r>
             <w:r>
               <w:rPr>
                 <w:i/>
                 <w:iCs/>
               </w:rPr>
-              <w:t>… năm 20</w:t>
+              <w:t xml:space="preserve"/>
             </w:r>
             <w:r>
               <w:rPr>
@@ -534,7 +534,7 @@
                 <w:iCs/>
                 <w:lang w:val="en-US"/>
               </w:rPr>
-              <w:t>…</w:t>
+              <w:t xml:space="preserve"/>
             </w:r>
           </w:p>
         </w:tc>
@@ -644,7 +644,7 @@
           <w:bCs/>
           <w:sz w:val="24"/>
         </w:rPr>
-        <w:t>VIỆN TRƯỞNG VIỆN KIỂ</w:t>
+        <w:t xml:space="preserve">{{official.issuerTitle}}</w:t>
       </w:r>
       <w:r>
         <w:rPr>
@@ -652,7 +652,7 @@
           <w:bCs/>
           <w:sz w:val="24"/>
         </w:rPr>
-        <w:t>M SÁT</w:t>
+        <w:t xml:space="preserve"/>
       </w:r>
       <w:r>
         <w:rPr>
@@ -660,13 +660,13 @@
           <w:vertAlign w:val="superscript"/>
           <w:lang w:val="en-US"/>
         </w:rPr>
-        <w:t>2</w:t>
+        <w:t xml:space="preserve"/>
       </w:r>
       <w:r>
         <w:rPr>
           <w:sz w:val="24"/>
         </w:rPr>
-        <w:t>…</w:t>
+        <w:t xml:space="preserve"/>
       </w:r>
     </w:p>
     <w:p>
@@ -765,145 +765,145 @@
         <w:jc w:val="both"/>
       </w:pPr>
       <w:r>
-        <w:t xml:space="preserve">Xét thấy </w:t>
-      </w:r>
-      <w:r>
-        <w:t xml:space="preserve">Quyết định khởi tố vụ án hình sự số … </w:t>
+        <w:t xml:space="preserve">Xét thấy Quyết định khởi tố vụ án hình sự số {{initiationRequest.originatingDecisionCode}} ngày {{initiationRequest.originatingDecisionDateText}} của {{initiationRequest.originatingIssuerName}} về tội {{initiationRequest.originalOffenseName}} quy định tại {{initiationRequest.originalLegalArticle}} của Bộ luật Hình sự, ngoài tội phạm đã khởi tố còn có căn cứ xác định dấu hiệu của tội {{initiationRequest.additionalOffenseName}} quy định tại {{initiationRequest.additionalLegalArticle}} của Bộ luật Hình sự nhưng chưa được khởi tố,</w:t>
+      </w:r>
+      <w:r>
+        <w:t xml:space="preserve"/>
       </w:r>
       <w:bookmarkStart w:id="0" w:name="_Hlk217800686"/>
       <w:r>
-        <w:t xml:space="preserve">ngày … tháng … năm … </w:t>
+        <w:t xml:space="preserve"/>
       </w:r>
       <w:bookmarkEnd w:id="0"/>
       <w:r>
         <w:rPr>
           <w:lang w:val="en-US"/>
         </w:rPr>
-        <w:t xml:space="preserve"> </w:t>
-      </w:r>
-      <w:r>
-        <w:t>của</w:t>
+        <w:t xml:space="preserve"/>
+      </w:r>
+      <w:r>
+        <w:t xml:space="preserve"/>
       </w:r>
       <w:r>
         <w:rPr>
           <w:vertAlign w:val="superscript"/>
           <w:lang w:val="en-US"/>
         </w:rPr>
-        <w:t>5</w:t>
-      </w:r>
-      <w:r>
-        <w:t>… về tội</w:t>
-      </w:r>
-      <w:r>
-        <w:rPr>
-          <w:lang w:val="en-US"/>
-        </w:rPr>
-        <w:t xml:space="preserve"> </w:t>
-      </w:r>
-      <w:r>
-        <w:t>…</w:t>
-      </w:r>
-      <w:r>
-        <w:rPr>
-          <w:lang w:val="en-US"/>
-        </w:rPr>
-        <w:t xml:space="preserve"> </w:t>
-      </w:r>
-      <w:r>
-        <w:t>quy định tại khoản</w:t>
-      </w:r>
-      <w:r>
-        <w:rPr>
-          <w:lang w:val="en-US"/>
-        </w:rPr>
-        <w:t xml:space="preserve"> </w:t>
-      </w:r>
-      <w:r>
-        <w:t>... Điều</w:t>
-      </w:r>
-      <w:r>
-        <w:rPr>
-          <w:lang w:val="en-US"/>
-        </w:rPr>
-        <w:t xml:space="preserve"> </w:t>
-      </w:r>
-      <w:r>
-        <w:t xml:space="preserve">… </w:t>
-      </w:r>
-      <w:r>
-        <w:rPr>
-          <w:lang w:val="en-US"/>
-        </w:rPr>
-        <w:t xml:space="preserve">của </w:t>
-      </w:r>
-      <w:r>
-        <w:t>Bộ luật Hình sự</w:t>
-      </w:r>
-      <w:r>
-        <w:rPr>
-          <w:lang w:val="en-US"/>
-        </w:rPr>
-        <w:t>, n</w:t>
-      </w:r>
-      <w:r>
-        <w:t xml:space="preserve">goài tội phạm đã khởi tố còn có căn cứ xác định dấu hiệu của </w:t>
-      </w:r>
-      <w:r>
-        <w:t>tội</w:t>
-      </w:r>
-      <w:r>
-        <w:rPr>
-          <w:lang w:val="en-US"/>
-        </w:rPr>
-        <w:t xml:space="preserve"> </w:t>
-      </w:r>
-      <w:r>
-        <w:t>…</w:t>
-      </w:r>
-      <w:r>
-        <w:rPr>
-          <w:lang w:val="en-US"/>
-        </w:rPr>
-        <w:t xml:space="preserve"> </w:t>
-      </w:r>
-      <w:r>
-        <w:t>quy định tại khoản</w:t>
-      </w:r>
-      <w:r>
-        <w:rPr>
-          <w:lang w:val="en-US"/>
-        </w:rPr>
-        <w:t xml:space="preserve"> </w:t>
-      </w:r>
-      <w:r>
-        <w:t>... Điều</w:t>
-      </w:r>
-      <w:r>
-        <w:rPr>
-          <w:lang w:val="en-US"/>
-        </w:rPr>
-        <w:t xml:space="preserve"> </w:t>
-      </w:r>
-      <w:r>
-        <w:t xml:space="preserve">… </w:t>
-      </w:r>
-      <w:r>
-        <w:rPr>
-          <w:lang w:val="en-US"/>
-        </w:rPr>
-        <w:t xml:space="preserve">của </w:t>
-      </w:r>
-      <w:r>
-        <w:t>Bộ luậ</w:t>
-      </w:r>
-      <w:r>
-        <w:t>t H</w:t>
-      </w:r>
-      <w:r>
-        <w:t>ình sự nhưng chưa được khởi tố</w:t>
-      </w:r>
-      <w:r>
-        <w:t>,</w:t>
+        <w:t xml:space="preserve"/>
+      </w:r>
+      <w:r>
+        <w:t xml:space="preserve"/>
+      </w:r>
+      <w:r>
+        <w:rPr>
+          <w:lang w:val="en-US"/>
+        </w:rPr>
+        <w:t xml:space="preserve"/>
+      </w:r>
+      <w:r>
+        <w:t xml:space="preserve"/>
+      </w:r>
+      <w:r>
+        <w:rPr>
+          <w:lang w:val="en-US"/>
+        </w:rPr>
+        <w:t xml:space="preserve"/>
+      </w:r>
+      <w:r>
+        <w:t xml:space="preserve"/>
+      </w:r>
+      <w:r>
+        <w:rPr>
+          <w:lang w:val="en-US"/>
+        </w:rPr>
+        <w:t xml:space="preserve"/>
+      </w:r>
+      <w:r>
+        <w:t xml:space="preserve"/>
+      </w:r>
+      <w:r>
+        <w:rPr>
+          <w:lang w:val="en-US"/>
+        </w:rPr>
+        <w:t xml:space="preserve"/>
+      </w:r>
+      <w:r>
+        <w:t xml:space="preserve"/>
+      </w:r>
+      <w:r>
+        <w:rPr>
+          <w:lang w:val="en-US"/>
+        </w:rPr>
+        <w:t xml:space="preserve"/>
+      </w:r>
+      <w:r>
+        <w:t xml:space="preserve"/>
+      </w:r>
+      <w:r>
+        <w:rPr>
+          <w:lang w:val="en-US"/>
+        </w:rPr>
+        <w:t xml:space="preserve"/>
+      </w:r>
+      <w:r>
+        <w:t xml:space="preserve"/>
+      </w:r>
+      <w:r>
+        <w:t xml:space="preserve"/>
+      </w:r>
+      <w:r>
+        <w:rPr>
+          <w:lang w:val="en-US"/>
+        </w:rPr>
+        <w:t xml:space="preserve"/>
+      </w:r>
+      <w:r>
+        <w:t xml:space="preserve"/>
+      </w:r>
+      <w:r>
+        <w:rPr>
+          <w:lang w:val="en-US"/>
+        </w:rPr>
+        <w:t xml:space="preserve"/>
+      </w:r>
+      <w:r>
+        <w:t xml:space="preserve"/>
+      </w:r>
+      <w:r>
+        <w:rPr>
+          <w:lang w:val="en-US"/>
+        </w:rPr>
+        <w:t xml:space="preserve"/>
+      </w:r>
+      <w:r>
+        <w:t xml:space="preserve"/>
+      </w:r>
+      <w:r>
+        <w:rPr>
+          <w:lang w:val="en-US"/>
+        </w:rPr>
+        <w:t xml:space="preserve"/>
+      </w:r>
+      <w:r>
+        <w:t xml:space="preserve"/>
+      </w:r>
+      <w:r>
+        <w:rPr>
+          <w:lang w:val="en-US"/>
+        </w:rPr>
+        <w:t xml:space="preserve"/>
+      </w:r>
+      <w:r>
+        <w:t xml:space="preserve"/>
+      </w:r>
+      <w:r>
+        <w:t xml:space="preserve"/>
+      </w:r>
+      <w:r>
+        <w:t xml:space="preserve"/>
+      </w:r>
+      <w:r>
+        <w:t xml:space="preserve"/>
       </w:r>
     </w:p>
     <w:p>
@@ -944,140 +944,140 @@
         <w:rPr>
           <w:lang w:val="en-US"/>
         </w:rPr>
-        <w:t>Cơ quan</w:t>
-      </w:r>
-      <w:r>
-        <w:rPr>
-          <w:lang w:val="en-US"/>
-        </w:rPr>
-        <w:t>, người</w:t>
-      </w:r>
-      <w:r>
-        <w:rPr>
-          <w:lang w:val="en-US"/>
-        </w:rPr>
-        <w:t xml:space="preserve"> có thẩm quyền</w:t>
+        <w:t xml:space="preserve">{{initiationRequest.orderedAuthorityName}} ra Quyết định bổ sung Quyết định khởi tố vụ án hình sự về tội {{initiationRequest.additionalOffenseName}} quy định tại {{initiationRequest.additionalLegalArticle}} của Bộ luật Hình sự, để tiến hành điều tra theo quy định của Bộ luật Tố tụng hình sự./.</w:t>
+      </w:r>
+      <w:r>
+        <w:rPr>
+          <w:lang w:val="en-US"/>
+        </w:rPr>
+        <w:t xml:space="preserve"/>
+      </w:r>
+      <w:r>
+        <w:rPr>
+          <w:lang w:val="en-US"/>
+        </w:rPr>
+        <w:t xml:space="preserve"/>
       </w:r>
       <w:r>
         <w:rPr>
           <w:vertAlign w:val="superscript"/>
           <w:lang w:val="en-US"/>
         </w:rPr>
-        <w:t>5</w:t>
-      </w:r>
-      <w:r>
-        <w:t>…</w:t>
-      </w:r>
-      <w:r>
-        <w:rPr>
-          <w:lang w:val="en-US"/>
-        </w:rPr>
-        <w:t xml:space="preserve"> </w:t>
-      </w:r>
-      <w:r>
-        <w:rPr>
-          <w:lang w:val="en-US"/>
-        </w:rPr>
-        <w:t xml:space="preserve">ra </w:t>
-      </w:r>
-      <w:r>
-        <w:rPr>
-          <w:lang w:val="en-US"/>
-        </w:rPr>
-        <w:t>Q</w:t>
-      </w:r>
-      <w:r>
-        <w:rPr>
-          <w:lang w:val="en-US"/>
-        </w:rPr>
-        <w:t>uyết định</w:t>
-      </w:r>
-      <w:r>
-        <w:rPr>
-          <w:lang w:val="en-US"/>
-        </w:rPr>
-        <w:t xml:space="preserve"> </w:t>
-      </w:r>
-      <w:r>
-        <w:t>bổ</w:t>
-      </w:r>
-      <w:r>
-        <w:t xml:space="preserve"> sung </w:t>
-      </w:r>
-      <w:r>
-        <w:rPr>
-          <w:lang w:val="en-US"/>
-        </w:rPr>
-        <w:t>Q</w:t>
-      </w:r>
-      <w:r>
-        <w:t xml:space="preserve">uyết định khởi tố vụ án hình sự về </w:t>
-      </w:r>
-      <w:r>
-        <w:t>tội</w:t>
-      </w:r>
-      <w:r>
-        <w:rPr>
-          <w:lang w:val="en-US"/>
-        </w:rPr>
-        <w:t xml:space="preserve"> </w:t>
-      </w:r>
-      <w:r>
-        <w:t>…</w:t>
-      </w:r>
-      <w:r>
-        <w:rPr>
-          <w:lang w:val="en-US"/>
-        </w:rPr>
-        <w:t xml:space="preserve"> </w:t>
-      </w:r>
-      <w:r>
-        <w:t>quy định tại khoản</w:t>
-      </w:r>
-      <w:r>
-        <w:rPr>
-          <w:lang w:val="en-US"/>
-        </w:rPr>
-        <w:t xml:space="preserve"> </w:t>
-      </w:r>
-      <w:r>
-        <w:t>... Điều</w:t>
-      </w:r>
-      <w:r>
-        <w:rPr>
-          <w:lang w:val="en-US"/>
-        </w:rPr>
-        <w:t xml:space="preserve"> </w:t>
-      </w:r>
-      <w:r>
-        <w:t xml:space="preserve">… </w:t>
-      </w:r>
-      <w:r>
-        <w:rPr>
-          <w:lang w:val="en-US"/>
-        </w:rPr>
-        <w:t>của</w:t>
-      </w:r>
-      <w:r>
-        <w:rPr>
-          <w:lang w:val="en-US"/>
-        </w:rPr>
-        <w:t xml:space="preserve"> </w:t>
-      </w:r>
-      <w:r>
-        <w:t>Bộ luậ</w:t>
-      </w:r>
-      <w:r>
-        <w:t>t H</w:t>
-      </w:r>
-      <w:r>
-        <w:t>ình sự, để tiến hành điều tra theo quy định của Bộ luậ</w:t>
-      </w:r>
-      <w:r>
-        <w:t>t T</w:t>
-      </w:r>
-      <w:r>
-        <w:t>ố tụng hình sự./.</w:t>
+        <w:t xml:space="preserve"/>
+      </w:r>
+      <w:r>
+        <w:t xml:space="preserve"/>
+      </w:r>
+      <w:r>
+        <w:rPr>
+          <w:lang w:val="en-US"/>
+        </w:rPr>
+        <w:t xml:space="preserve"/>
+      </w:r>
+      <w:r>
+        <w:rPr>
+          <w:lang w:val="en-US"/>
+        </w:rPr>
+        <w:t xml:space="preserve"/>
+      </w:r>
+      <w:r>
+        <w:rPr>
+          <w:lang w:val="en-US"/>
+        </w:rPr>
+        <w:t xml:space="preserve"/>
+      </w:r>
+      <w:r>
+        <w:rPr>
+          <w:lang w:val="en-US"/>
+        </w:rPr>
+        <w:t xml:space="preserve"/>
+      </w:r>
+      <w:r>
+        <w:rPr>
+          <w:lang w:val="en-US"/>
+        </w:rPr>
+        <w:t xml:space="preserve"/>
+      </w:r>
+      <w:r>
+        <w:t xml:space="preserve"/>
+      </w:r>
+      <w:r>
+        <w:t xml:space="preserve"/>
+      </w:r>
+      <w:r>
+        <w:rPr>
+          <w:lang w:val="en-US"/>
+        </w:rPr>
+        <w:t xml:space="preserve"/>
+      </w:r>
+      <w:r>
+        <w:t xml:space="preserve"/>
+      </w:r>
+      <w:r>
+        <w:t xml:space="preserve"/>
+      </w:r>
+      <w:r>
+        <w:rPr>
+          <w:lang w:val="en-US"/>
+        </w:rPr>
+        <w:t xml:space="preserve"/>
+      </w:r>
+      <w:r>
+        <w:t xml:space="preserve"/>
+      </w:r>
+      <w:r>
+        <w:rPr>
+          <w:lang w:val="en-US"/>
+        </w:rPr>
+        <w:t xml:space="preserve"/>
+      </w:r>
+      <w:r>
+        <w:t xml:space="preserve"/>
+      </w:r>
+      <w:r>
+        <w:rPr>
+          <w:lang w:val="en-US"/>
+        </w:rPr>
+        <w:t xml:space="preserve"/>
+      </w:r>
+      <w:r>
+        <w:t xml:space="preserve"/>
+      </w:r>
+      <w:r>
+        <w:rPr>
+          <w:lang w:val="en-US"/>
+        </w:rPr>
+        <w:t xml:space="preserve"/>
+      </w:r>
+      <w:r>
+        <w:t xml:space="preserve"/>
+      </w:r>
+      <w:r>
+        <w:rPr>
+          <w:lang w:val="en-US"/>
+        </w:rPr>
+        <w:t xml:space="preserve"/>
+      </w:r>
+      <w:r>
+        <w:rPr>
+          <w:lang w:val="en-US"/>
+        </w:rPr>
+        <w:t xml:space="preserve"/>
+      </w:r>
+      <w:r>
+        <w:t xml:space="preserve"/>
+      </w:r>
+      <w:r>
+        <w:t xml:space="preserve"/>
+      </w:r>
+      <w:r>
+        <w:t xml:space="preserve"/>
+      </w:r>
+      <w:r>
+        <w:t xml:space="preserve"/>
+      </w:r>
+      <w:r>
+        <w:t xml:space="preserve"/>
       </w:r>
     </w:p>
     <w:p>
@@ -1131,7 +1131,7 @@
                 <w:sz w:val="22"/>
                 <w:lang w:val="en-US"/>
               </w:rPr>
-              <w:t xml:space="preserve">- </w:t>
+              <w:t xml:space="preserve">- {{initiationRequest.orderedAuthorityName}};</w:t>
             </w:r>
             <w:r>
               <w:rPr>
@@ -1139,21 +1139,21 @@
                 <w:vertAlign w:val="superscript"/>
                 <w:lang w:val="en-US"/>
               </w:rPr>
-              <w:t>5</w:t>
+              <w:t xml:space="preserve"/>
             </w:r>
             <w:r>
               <w:rPr>
                 <w:sz w:val="22"/>
                 <w:lang w:val="en-US"/>
               </w:rPr>
-              <w:t>...</w:t>
+              <w:t xml:space="preserve"/>
             </w:r>
             <w:r>
               <w:rPr>
                 <w:sz w:val="22"/>
                 <w:lang w:val="en-US"/>
               </w:rPr>
-              <w:t>;</w:t>
+              <w:t xml:space="preserve"/>
             </w:r>
           </w:p>
           <w:p>
@@ -1169,28 +1169,28 @@
               <w:rPr>
                 <w:sz w:val="22"/>
               </w:rPr>
-              <w:t>- Lưu</w:t>
+              <w:t xml:space="preserve">- {{recipients.archiveLine}}.</w:t>
             </w:r>
             <w:r>
               <w:rPr>
                 <w:sz w:val="22"/>
                 <w:lang w:val="en-US"/>
               </w:rPr>
-              <w:t xml:space="preserve">: </w:t>
+              <w:t xml:space="preserve"/>
             </w:r>
             <w:r>
               <w:rPr>
                 <w:sz w:val="22"/>
                 <w:lang w:val="en-US"/>
               </w:rPr>
-              <w:t xml:space="preserve">HSVA, </w:t>
+              <w:t xml:space="preserve"/>
             </w:r>
             <w:r>
               <w:rPr>
                 <w:sz w:val="22"/>
                 <w:lang w:val="en-US"/>
               </w:rPr>
-              <w:t>HSKS, VP.</w:t>
+              <w:t xml:space="preserve"/>
             </w:r>
           </w:p>
         </w:tc>
@@ -1217,7 +1217,7 @@
                 <w:bCs/>
                 <w:sz w:val="24"/>
               </w:rPr>
-              <w:t xml:space="preserve">  </w:t>
+              <w:t xml:space="preserve">{{signature.signMode}}</w:t>
             </w:r>
             <w:r>
               <w:rPr>
@@ -1227,7 +1227,7 @@
                 <w:vertAlign w:val="superscript"/>
                 <w:lang w:val="en-US"/>
               </w:rPr>
-              <w:t>6</w:t>
+              <w:t xml:space="preserve"/>
             </w:r>
             <w:r>
               <w:rPr>
@@ -1236,7 +1236,7 @@
                 <w:sz w:val="24"/>
                 <w:lang w:val="en-US"/>
               </w:rPr>
-              <w:t>……………</w:t>
+              <w:t xml:space="preserve"/>
             </w:r>
             <w:r>
               <w:rPr>
@@ -1245,7 +1245,7 @@
                 <w:sz w:val="24"/>
                 <w:lang w:val="en-US"/>
               </w:rPr>
-              <w:t>…..</w:t>
+              <w:t xml:space="preserve"/>
             </w:r>
             <w:r>
               <w:rPr>
@@ -1254,7 +1254,125 @@
                 <w:sz w:val="24"/>
                 <w:lang w:val="en-US"/>
               </w:rPr>
-              <w:t>……………</w:t>
+              <w:t xml:space="preserve"/>
+            </w:r>
+          </w:p>
+          <w:p>
+            <w:pPr>
+              <w:keepNext/>
+              <w:spacing w:before="0"/>
+              <w:jc w:val="center"/>
+              <w:outlineLvl w:val="1"/>
+              <w:rPr>
+                <w:b/>
+                <w:bCs/>
+                <w:sz w:val="24"/>
+                <w:lang w:val="en-US"/>
+              </w:rPr>
+            </w:pPr>
+            <w:r>
+              <w:rPr>
+                <w:b/>
+                <w:bCs/>
+                <w:sz w:val="24"/>
+              </w:rPr>
+              <w:t xml:space="preserve">{{signature.positionTitle}}</w:t>
+            </w:r>
+            <w:r>
+              <w:rPr>
+                <w:b/>
+                <w:bCs/>
+                <w:sz w:val="24"/>
+                <w:vertAlign w:val="superscript"/>
+                <w:lang w:val="en-US"/>
+              </w:rPr>
+              <w:t xml:space="preserve"/>
+            </w:r>
+            <w:r>
+              <w:rPr>
+                <w:b/>
+                <w:bCs/>
+                <w:sz w:val="24"/>
+                <w:lang w:val="en-US"/>
+              </w:rPr>
+              <w:t xml:space="preserve"/>
+            </w:r>
+            <w:r>
+              <w:rPr>
+                <w:b/>
+                <w:bCs/>
+                <w:sz w:val="24"/>
+                <w:lang w:val="en-US"/>
+              </w:rPr>
+              <w:t xml:space="preserve"/>
+            </w:r>
+            <w:r>
+              <w:rPr>
+                <w:b/>
+                <w:bCs/>
+                <w:sz w:val="24"/>
+                <w:lang w:val="en-US"/>
+              </w:rPr>
+              <w:t xml:space="preserve"/>
+            </w:r>
+          </w:p>
+          <w:p>
+            <w:pPr>
+              <w:keepNext/>
+              <w:spacing w:before="0"/>
+              <w:jc w:val="center"/>
+              <w:outlineLvl w:val="1"/>
+              <w:rPr>
+                <w:b/>
+                <w:bCs/>
+                <w:sz w:val="24"/>
+                <w:lang w:val="en-US"/>
+              </w:rPr>
+            </w:pPr>
+            <w:r>
+              <w:rPr>
+                <w:b/>
+                <w:bCs/>
+                <w:sz w:val="24"/>
+              </w:rPr>
+              <w:t xml:space="preserve">{{signature.signerName}}</w:t>
+            </w:r>
+            <w:r>
+              <w:rPr>
+                <w:b/>
+                <w:bCs/>
+                <w:sz w:val="24"/>
+                <w:vertAlign w:val="superscript"/>
+                <w:lang w:val="en-US"/>
+              </w:rPr>
+              <w:t xml:space="preserve"/>
+            </w:r>
+            <w:r>
+              <w:rPr>
+                <w:b/>
+                <w:bCs/>
+                <w:sz w:val="24"/>
+                <w:lang w:val="en-US"/>
+              </w:rPr>
+              <w:t xml:space="preserve"/>
+            </w:r>
+            <w:r>
+              <w:rPr>
+                <w:b/>
+                <w:bCs/>
+                <w:sz w:val="24"/>
+                <w:lang w:val="en-US"/>
+              </w:rPr>
+              <w:t xml:space="preserve"/>
+            </w:r>
+            <w:r>
+              <w:rPr>
+                <w:b/>
+                <w:bCs/>
+                <w:sz w:val="24"/>
+                <w:lang w:val="en-US"/>
+              </w:rPr>
+              <w:t xml:space="preserve"/>
             </w:r>
           </w:p>
           <w:p>

</xml_diff>